<commit_message>
Every page that describes the drill says the read before the draft is required and what it counts toward
README replaces the ledger-only picks section with the read before the draft: the ruling, the
screen, why it cannot be skipped, what the end screen says, the round one cell, the record fields
and what the findings report, and the data notice quote and version now match the page. The
readout template gains section 8 for the prepick fields, both facilitator guides tell the room the
read is required and the long guide adds a debrief on it, review.html mentions it in the strip,
the outcomes note and the scope, and the case guide says the read is taken per ledger account.
The facilitator PDF and both docx files are rebuilt, the one-page guide at one page and the
readout at three.

Co-Authored-By: Claude Opus 5 <noreply@anthropic.com>
</commit_message>
<xml_diff>
--- a/Second-Pass-Results-Readout.docx
+++ b/Second-Pass-Results-Readout.docx
@@ -4,7 +4,7 @@
   <w:body>
     <w:p>
       <w:pPr>
-        <w:spacing w:before="0" w:after="128" w:line="240" w:lineRule="auto"/>
+        <w:spacing w:before="0" w:after="96" w:line="240" w:lineRule="auto"/>
         <w:jc w:val="center"/>
         <w:keepNext/>
       </w:pPr>
@@ -19,7 +19,7 @@
     </w:p>
     <w:p>
       <w:pPr>
-        <w:spacing w:before="96" w:after="0" w:line="240" w:lineRule="auto"/>
+        <w:spacing w:before="72" w:after="0" w:line="240" w:lineRule="auto"/>
       </w:pPr>
       <w:r>
         <w:rPr>
@@ -48,7 +48,7 @@
     </w:p>
     <w:p>
       <w:pPr>
-        <w:spacing w:before="96" w:after="0" w:line="240" w:lineRule="auto"/>
+        <w:spacing w:before="72" w:after="0" w:line="240" w:lineRule="auto"/>
       </w:pPr>
       <w:r>
         <w:rPr>
@@ -61,7 +61,7 @@
     </w:p>
     <w:p>
       <w:pPr>
-        <w:spacing w:before="160" w:after="64" w:line="240" w:lineRule="auto"/>
+        <w:spacing w:before="120" w:after="48" w:line="240" w:lineRule="auto"/>
         <w:pBdr>
           <w:bottom w:val="single" w:sz="6" w:space="1" w:color="000000"/>
         </w:pBdr>
@@ -79,7 +79,7 @@
     </w:p>
     <w:p>
       <w:pPr>
-        <w:spacing w:before="80" w:after="0" w:line="240" w:lineRule="auto"/>
+        <w:spacing w:before="60" w:after="0" w:line="240" w:lineRule="auto"/>
         <w:rPr>
           <w:sz w:val="2"/>
           <w:szCs w:val="2"/>
@@ -114,7 +114,7 @@
           </w:tcPr>
           <w:p>
             <w:pPr>
-              <w:spacing w:before="13" w:after="13" w:line="240" w:lineRule="auto"/>
+              <w:spacing w:before="10" w:after="10" w:line="240" w:lineRule="auto"/>
             </w:pPr>
             <w:r>
               <w:rPr>
@@ -138,7 +138,7 @@
           </w:tcPr>
           <w:p>
             <w:pPr>
-              <w:spacing w:before="13" w:after="13" w:line="240" w:lineRule="auto"/>
+              <w:spacing w:before="10" w:after="10" w:line="240" w:lineRule="auto"/>
             </w:pPr>
             <w:r>
               <w:rPr>
@@ -162,7 +162,7 @@
           </w:tcPr>
           <w:p>
             <w:pPr>
-              <w:spacing w:before="13" w:after="13" w:line="240" w:lineRule="auto"/>
+              <w:spacing w:before="10" w:after="10" w:line="240" w:lineRule="auto"/>
             </w:pPr>
             <w:r>
               <w:rPr>
@@ -188,7 +188,7 @@
           </w:tcPr>
           <w:p>
             <w:pPr>
-              <w:spacing w:before="13" w:after="13" w:line="240" w:lineRule="auto"/>
+              <w:spacing w:before="10" w:after="10" w:line="240" w:lineRule="auto"/>
             </w:pPr>
             <w:r>
               <w:rPr>
@@ -212,7 +212,7 @@
           </w:tcPr>
           <w:p>
             <w:pPr>
-              <w:spacing w:before="13" w:after="13" w:line="240" w:lineRule="auto"/>
+              <w:spacing w:before="10" w:after="10" w:line="240" w:lineRule="auto"/>
             </w:pPr>
             <w:r>
               <w:rPr>
@@ -236,7 +236,7 @@
           </w:tcPr>
           <w:p>
             <w:pPr>
-              <w:spacing w:before="13" w:after="13" w:line="240" w:lineRule="auto"/>
+              <w:spacing w:before="10" w:after="10" w:line="240" w:lineRule="auto"/>
             </w:pPr>
             <w:r>
               <w:rPr>
@@ -262,7 +262,7 @@
           </w:tcPr>
           <w:p>
             <w:pPr>
-              <w:spacing w:before="13" w:after="13" w:line="240" w:lineRule="auto"/>
+              <w:spacing w:before="10" w:after="10" w:line="240" w:lineRule="auto"/>
             </w:pPr>
             <w:r>
               <w:rPr>
@@ -286,7 +286,7 @@
           </w:tcPr>
           <w:p>
             <w:pPr>
-              <w:spacing w:before="13" w:after="13" w:line="240" w:lineRule="auto"/>
+              <w:spacing w:before="10" w:after="10" w:line="240" w:lineRule="auto"/>
             </w:pPr>
             <w:r>
               <w:rPr>
@@ -310,7 +310,7 @@
           </w:tcPr>
           <w:p>
             <w:pPr>
-              <w:spacing w:before="13" w:after="13" w:line="240" w:lineRule="auto"/>
+              <w:spacing w:before="10" w:after="10" w:line="240" w:lineRule="auto"/>
             </w:pPr>
             <w:r>
               <w:rPr>
@@ -336,7 +336,7 @@
           </w:tcPr>
           <w:p>
             <w:pPr>
-              <w:spacing w:before="13" w:after="13" w:line="240" w:lineRule="auto"/>
+              <w:spacing w:before="10" w:after="10" w:line="240" w:lineRule="auto"/>
             </w:pPr>
             <w:r>
               <w:rPr>
@@ -360,7 +360,7 @@
           </w:tcPr>
           <w:p>
             <w:pPr>
-              <w:spacing w:before="13" w:after="13" w:line="240" w:lineRule="auto"/>
+              <w:spacing w:before="10" w:after="10" w:line="240" w:lineRule="auto"/>
             </w:pPr>
             <w:r>
               <w:rPr>
@@ -384,7 +384,7 @@
           </w:tcPr>
           <w:p>
             <w:pPr>
-              <w:spacing w:before="13" w:after="13" w:line="240" w:lineRule="auto"/>
+              <w:spacing w:before="10" w:after="10" w:line="240" w:lineRule="auto"/>
             </w:pPr>
             <w:r>
               <w:rPr>
@@ -410,7 +410,7 @@
           </w:tcPr>
           <w:p>
             <w:pPr>
-              <w:spacing w:before="13" w:after="13" w:line="240" w:lineRule="auto"/>
+              <w:spacing w:before="10" w:after="10" w:line="240" w:lineRule="auto"/>
             </w:pPr>
             <w:r>
               <w:rPr>
@@ -434,7 +434,7 @@
           </w:tcPr>
           <w:p>
             <w:pPr>
-              <w:spacing w:before="13" w:after="13" w:line="240" w:lineRule="auto"/>
+              <w:spacing w:before="10" w:after="10" w:line="240" w:lineRule="auto"/>
             </w:pPr>
             <w:r>
               <w:rPr>
@@ -458,7 +458,7 @@
           </w:tcPr>
           <w:p>
             <w:pPr>
-              <w:spacing w:before="13" w:after="13" w:line="240" w:lineRule="auto"/>
+              <w:spacing w:before="10" w:after="10" w:line="240" w:lineRule="auto"/>
             </w:pPr>
             <w:r>
               <w:rPr>
@@ -484,7 +484,7 @@
           </w:tcPr>
           <w:p>
             <w:pPr>
-              <w:spacing w:before="13" w:after="13" w:line="240" w:lineRule="auto"/>
+              <w:spacing w:before="10" w:after="10" w:line="240" w:lineRule="auto"/>
             </w:pPr>
             <w:r>
               <w:rPr>
@@ -508,7 +508,7 @@
           </w:tcPr>
           <w:p>
             <w:pPr>
-              <w:spacing w:before="13" w:after="13" w:line="240" w:lineRule="auto"/>
+              <w:spacing w:before="10" w:after="10" w:line="240" w:lineRule="auto"/>
             </w:pPr>
             <w:r>
               <w:rPr>
@@ -532,7 +532,7 @@
           </w:tcPr>
           <w:p>
             <w:pPr>
-              <w:spacing w:before="13" w:after="13" w:line="240" w:lineRule="auto"/>
+              <w:spacing w:before="10" w:after="10" w:line="240" w:lineRule="auto"/>
             </w:pPr>
             <w:r>
               <w:rPr>
@@ -558,7 +558,7 @@
           </w:tcPr>
           <w:p>
             <w:pPr>
-              <w:spacing w:before="13" w:after="13" w:line="240" w:lineRule="auto"/>
+              <w:spacing w:before="10" w:after="10" w:line="240" w:lineRule="auto"/>
             </w:pPr>
             <w:r>
               <w:rPr>
@@ -582,7 +582,7 @@
           </w:tcPr>
           <w:p>
             <w:pPr>
-              <w:spacing w:before="13" w:after="13" w:line="240" w:lineRule="auto"/>
+              <w:spacing w:before="10" w:after="10" w:line="240" w:lineRule="auto"/>
             </w:pPr>
             <w:r>
               <w:rPr>
@@ -606,7 +606,7 @@
           </w:tcPr>
           <w:p>
             <w:pPr>
-              <w:spacing w:before="13" w:after="13" w:line="240" w:lineRule="auto"/>
+              <w:spacing w:before="10" w:after="10" w:line="240" w:lineRule="auto"/>
             </w:pPr>
             <w:r>
               <w:rPr>
@@ -632,7 +632,7 @@
           </w:tcPr>
           <w:p>
             <w:pPr>
-              <w:spacing w:before="13" w:after="13" w:line="240" w:lineRule="auto"/>
+              <w:spacing w:before="10" w:after="10" w:line="240" w:lineRule="auto"/>
             </w:pPr>
             <w:r>
               <w:rPr>
@@ -656,7 +656,7 @@
           </w:tcPr>
           <w:p>
             <w:pPr>
-              <w:spacing w:before="13" w:after="13" w:line="240" w:lineRule="auto"/>
+              <w:spacing w:before="10" w:after="10" w:line="240" w:lineRule="auto"/>
             </w:pPr>
             <w:r>
               <w:rPr>
@@ -680,7 +680,7 @@
           </w:tcPr>
           <w:p>
             <w:pPr>
-              <w:spacing w:before="13" w:after="13" w:line="240" w:lineRule="auto"/>
+              <w:spacing w:before="10" w:after="10" w:line="240" w:lineRule="auto"/>
             </w:pPr>
             <w:r>
               <w:rPr>
@@ -706,7 +706,7 @@
           </w:tcPr>
           <w:p>
             <w:pPr>
-              <w:spacing w:before="13" w:after="13" w:line="240" w:lineRule="auto"/>
+              <w:spacing w:before="10" w:after="10" w:line="240" w:lineRule="auto"/>
             </w:pPr>
             <w:r>
               <w:rPr>
@@ -730,7 +730,7 @@
           </w:tcPr>
           <w:p>
             <w:pPr>
-              <w:spacing w:before="13" w:after="13" w:line="240" w:lineRule="auto"/>
+              <w:spacing w:before="10" w:after="10" w:line="240" w:lineRule="auto"/>
             </w:pPr>
             <w:r>
               <w:rPr>
@@ -754,7 +754,7 @@
           </w:tcPr>
           <w:p>
             <w:pPr>
-              <w:spacing w:before="13" w:after="13" w:line="240" w:lineRule="auto"/>
+              <w:spacing w:before="10" w:after="10" w:line="240" w:lineRule="auto"/>
             </w:pPr>
             <w:r>
               <w:rPr>
@@ -780,7 +780,7 @@
           </w:tcPr>
           <w:p>
             <w:pPr>
-              <w:spacing w:before="13" w:after="13" w:line="240" w:lineRule="auto"/>
+              <w:spacing w:before="10" w:after="10" w:line="240" w:lineRule="auto"/>
             </w:pPr>
             <w:r>
               <w:rPr>
@@ -804,7 +804,7 @@
           </w:tcPr>
           <w:p>
             <w:pPr>
-              <w:spacing w:before="13" w:after="13" w:line="240" w:lineRule="auto"/>
+              <w:spacing w:before="10" w:after="10" w:line="240" w:lineRule="auto"/>
             </w:pPr>
             <w:r>
               <w:rPr>
@@ -828,7 +828,7 @@
           </w:tcPr>
           <w:p>
             <w:pPr>
-              <w:spacing w:before="13" w:after="13" w:line="240" w:lineRule="auto"/>
+              <w:spacing w:before="10" w:after="10" w:line="240" w:lineRule="auto"/>
             </w:pPr>
             <w:r>
               <w:rPr>
@@ -854,7 +854,7 @@
           </w:tcPr>
           <w:p>
             <w:pPr>
-              <w:spacing w:before="13" w:after="13" w:line="240" w:lineRule="auto"/>
+              <w:spacing w:before="10" w:after="10" w:line="240" w:lineRule="auto"/>
             </w:pPr>
             <w:r>
               <w:rPr>
@@ -878,7 +878,7 @@
           </w:tcPr>
           <w:p>
             <w:pPr>
-              <w:spacing w:before="13" w:after="13" w:line="240" w:lineRule="auto"/>
+              <w:spacing w:before="10" w:after="10" w:line="240" w:lineRule="auto"/>
             </w:pPr>
             <w:r>
               <w:rPr>
@@ -902,7 +902,7 @@
           </w:tcPr>
           <w:p>
             <w:pPr>
-              <w:spacing w:before="13" w:after="13" w:line="240" w:lineRule="auto"/>
+              <w:spacing w:before="10" w:after="10" w:line="240" w:lineRule="auto"/>
             </w:pPr>
             <w:r>
               <w:rPr>
@@ -918,7 +918,7 @@
     </w:tbl>
     <w:p>
       <w:pPr>
-        <w:spacing w:before="96" w:after="0" w:line="240" w:lineRule="auto"/>
+        <w:spacing w:before="72" w:after="0" w:line="240" w:lineRule="auto"/>
         <w:rPr>
           <w:sz w:val="2"/>
           <w:szCs w:val="2"/>
@@ -927,7 +927,7 @@
     </w:p>
     <w:p>
       <w:pPr>
-        <w:spacing w:before="96" w:after="0" w:line="240" w:lineRule="auto"/>
+        <w:spacing w:before="72" w:after="0" w:line="240" w:lineRule="auto"/>
       </w:pPr>
       <w:r>
         <w:rPr>
@@ -940,7 +940,7 @@
     </w:p>
     <w:p>
       <w:pPr>
-        <w:spacing w:before="160" w:after="64" w:line="240" w:lineRule="auto"/>
+        <w:spacing w:before="120" w:after="48" w:line="240" w:lineRule="auto"/>
         <w:pBdr>
           <w:bottom w:val="single" w:sz="6" w:space="1" w:color="000000"/>
         </w:pBdr>
@@ -971,7 +971,7 @@
     </w:p>
     <w:p>
       <w:pPr>
-        <w:spacing w:before="80" w:after="0" w:line="240" w:lineRule="auto"/>
+        <w:spacing w:before="60" w:after="0" w:line="240" w:lineRule="auto"/>
         <w:rPr>
           <w:sz w:val="2"/>
           <w:szCs w:val="2"/>
@@ -1007,7 +1007,7 @@
           </w:tcPr>
           <w:p>
             <w:pPr>
-              <w:spacing w:before="13" w:after="13" w:line="240" w:lineRule="auto"/>
+              <w:spacing w:before="10" w:after="10" w:line="240" w:lineRule="auto"/>
             </w:pPr>
             <w:r>
               <w:rPr>
@@ -1031,7 +1031,7 @@
           </w:tcPr>
           <w:p>
             <w:pPr>
-              <w:spacing w:before="13" w:after="13" w:line="240" w:lineRule="auto"/>
+              <w:spacing w:before="10" w:after="10" w:line="240" w:lineRule="auto"/>
             </w:pPr>
             <w:r>
               <w:rPr>
@@ -1055,7 +1055,7 @@
           </w:tcPr>
           <w:p>
             <w:pPr>
-              <w:spacing w:before="13" w:after="13" w:line="240" w:lineRule="auto"/>
+              <w:spacing w:before="10" w:after="10" w:line="240" w:lineRule="auto"/>
             </w:pPr>
             <w:r>
               <w:rPr>
@@ -1079,7 +1079,7 @@
           </w:tcPr>
           <w:p>
             <w:pPr>
-              <w:spacing w:before="13" w:after="13" w:line="240" w:lineRule="auto"/>
+              <w:spacing w:before="10" w:after="10" w:line="240" w:lineRule="auto"/>
             </w:pPr>
             <w:r>
               <w:rPr>
@@ -1105,7 +1105,7 @@
           </w:tcPr>
           <w:p>
             <w:pPr>
-              <w:spacing w:before="13" w:after="13" w:line="240" w:lineRule="auto"/>
+              <w:spacing w:before="10" w:after="10" w:line="240" w:lineRule="auto"/>
             </w:pPr>
             <w:r>
               <w:rPr>
@@ -1129,7 +1129,7 @@
           </w:tcPr>
           <w:p>
             <w:pPr>
-              <w:spacing w:before="13" w:after="13" w:line="240" w:lineRule="auto"/>
+              <w:spacing w:before="10" w:after="10" w:line="240" w:lineRule="auto"/>
             </w:pPr>
           </w:p>
         </w:tc>
@@ -1145,7 +1145,7 @@
           </w:tcPr>
           <w:p>
             <w:pPr>
-              <w:spacing w:before="13" w:after="13" w:line="240" w:lineRule="auto"/>
+              <w:spacing w:before="10" w:after="10" w:line="240" w:lineRule="auto"/>
             </w:pPr>
           </w:p>
         </w:tc>
@@ -1161,7 +1161,7 @@
           </w:tcPr>
           <w:p>
             <w:pPr>
-              <w:spacing w:before="13" w:after="13" w:line="240" w:lineRule="auto"/>
+              <w:spacing w:before="10" w:after="10" w:line="240" w:lineRule="auto"/>
             </w:pPr>
           </w:p>
         </w:tc>
@@ -1179,7 +1179,7 @@
           </w:tcPr>
           <w:p>
             <w:pPr>
-              <w:spacing w:before="13" w:after="13" w:line="240" w:lineRule="auto"/>
+              <w:spacing w:before="10" w:after="10" w:line="240" w:lineRule="auto"/>
             </w:pPr>
             <w:r>
               <w:rPr>
@@ -1203,7 +1203,7 @@
           </w:tcPr>
           <w:p>
             <w:pPr>
-              <w:spacing w:before="13" w:after="13" w:line="240" w:lineRule="auto"/>
+              <w:spacing w:before="10" w:after="10" w:line="240" w:lineRule="auto"/>
             </w:pPr>
           </w:p>
         </w:tc>
@@ -1219,7 +1219,7 @@
           </w:tcPr>
           <w:p>
             <w:pPr>
-              <w:spacing w:before="13" w:after="13" w:line="240" w:lineRule="auto"/>
+              <w:spacing w:before="10" w:after="10" w:line="240" w:lineRule="auto"/>
             </w:pPr>
           </w:p>
         </w:tc>
@@ -1235,7 +1235,7 @@
           </w:tcPr>
           <w:p>
             <w:pPr>
-              <w:spacing w:before="13" w:after="13" w:line="240" w:lineRule="auto"/>
+              <w:spacing w:before="10" w:after="10" w:line="240" w:lineRule="auto"/>
             </w:pPr>
           </w:p>
         </w:tc>
@@ -1253,7 +1253,7 @@
           </w:tcPr>
           <w:p>
             <w:pPr>
-              <w:spacing w:before="13" w:after="13" w:line="240" w:lineRule="auto"/>
+              <w:spacing w:before="10" w:after="10" w:line="240" w:lineRule="auto"/>
             </w:pPr>
             <w:r>
               <w:rPr>
@@ -1277,7 +1277,7 @@
           </w:tcPr>
           <w:p>
             <w:pPr>
-              <w:spacing w:before="13" w:after="13" w:line="240" w:lineRule="auto"/>
+              <w:spacing w:before="10" w:after="10" w:line="240" w:lineRule="auto"/>
             </w:pPr>
           </w:p>
         </w:tc>
@@ -1293,7 +1293,7 @@
           </w:tcPr>
           <w:p>
             <w:pPr>
-              <w:spacing w:before="13" w:after="13" w:line="240" w:lineRule="auto"/>
+              <w:spacing w:before="10" w:after="10" w:line="240" w:lineRule="auto"/>
             </w:pPr>
           </w:p>
         </w:tc>
@@ -1309,7 +1309,7 @@
           </w:tcPr>
           <w:p>
             <w:pPr>
-              <w:spacing w:before="13" w:after="13" w:line="240" w:lineRule="auto"/>
+              <w:spacing w:before="10" w:after="10" w:line="240" w:lineRule="auto"/>
             </w:pPr>
           </w:p>
         </w:tc>
@@ -1327,7 +1327,7 @@
           </w:tcPr>
           <w:p>
             <w:pPr>
-              <w:spacing w:before="13" w:after="13" w:line="240" w:lineRule="auto"/>
+              <w:spacing w:before="10" w:after="10" w:line="240" w:lineRule="auto"/>
             </w:pPr>
             <w:r>
               <w:rPr>
@@ -1351,7 +1351,7 @@
           </w:tcPr>
           <w:p>
             <w:pPr>
-              <w:spacing w:before="13" w:after="13" w:line="240" w:lineRule="auto"/>
+              <w:spacing w:before="10" w:after="10" w:line="240" w:lineRule="auto"/>
             </w:pPr>
           </w:p>
         </w:tc>
@@ -1367,7 +1367,7 @@
           </w:tcPr>
           <w:p>
             <w:pPr>
-              <w:spacing w:before="13" w:after="13" w:line="240" w:lineRule="auto"/>
+              <w:spacing w:before="10" w:after="10" w:line="240" w:lineRule="auto"/>
             </w:pPr>
           </w:p>
         </w:tc>
@@ -1383,7 +1383,7 @@
           </w:tcPr>
           <w:p>
             <w:pPr>
-              <w:spacing w:before="13" w:after="13" w:line="240" w:lineRule="auto"/>
+              <w:spacing w:before="10" w:after="10" w:line="240" w:lineRule="auto"/>
             </w:pPr>
           </w:p>
         </w:tc>
@@ -1401,7 +1401,7 @@
           </w:tcPr>
           <w:p>
             <w:pPr>
-              <w:spacing w:before="13" w:after="13" w:line="240" w:lineRule="auto"/>
+              <w:spacing w:before="10" w:after="10" w:line="240" w:lineRule="auto"/>
             </w:pPr>
             <w:r>
               <w:rPr>
@@ -1425,7 +1425,7 @@
           </w:tcPr>
           <w:p>
             <w:pPr>
-              <w:spacing w:before="13" w:after="13" w:line="240" w:lineRule="auto"/>
+              <w:spacing w:before="10" w:after="10" w:line="240" w:lineRule="auto"/>
             </w:pPr>
           </w:p>
         </w:tc>
@@ -1441,7 +1441,7 @@
           </w:tcPr>
           <w:p>
             <w:pPr>
-              <w:spacing w:before="13" w:after="13" w:line="240" w:lineRule="auto"/>
+              <w:spacing w:before="10" w:after="10" w:line="240" w:lineRule="auto"/>
             </w:pPr>
           </w:p>
         </w:tc>
@@ -1457,7 +1457,7 @@
           </w:tcPr>
           <w:p>
             <w:pPr>
-              <w:spacing w:before="13" w:after="13" w:line="240" w:lineRule="auto"/>
+              <w:spacing w:before="10" w:after="10" w:line="240" w:lineRule="auto"/>
             </w:pPr>
           </w:p>
         </w:tc>
@@ -1475,7 +1475,7 @@
           </w:tcPr>
           <w:p>
             <w:pPr>
-              <w:spacing w:before="13" w:after="13" w:line="240" w:lineRule="auto"/>
+              <w:spacing w:before="10" w:after="10" w:line="240" w:lineRule="auto"/>
             </w:pPr>
             <w:r>
               <w:rPr>
@@ -1499,7 +1499,7 @@
           </w:tcPr>
           <w:p>
             <w:pPr>
-              <w:spacing w:before="13" w:after="13" w:line="240" w:lineRule="auto"/>
+              <w:spacing w:before="10" w:after="10" w:line="240" w:lineRule="auto"/>
             </w:pPr>
           </w:p>
         </w:tc>
@@ -1515,7 +1515,7 @@
           </w:tcPr>
           <w:p>
             <w:pPr>
-              <w:spacing w:before="13" w:after="13" w:line="240" w:lineRule="auto"/>
+              <w:spacing w:before="10" w:after="10" w:line="240" w:lineRule="auto"/>
             </w:pPr>
           </w:p>
         </w:tc>
@@ -1531,7 +1531,7 @@
           </w:tcPr>
           <w:p>
             <w:pPr>
-              <w:spacing w:before="13" w:after="13" w:line="240" w:lineRule="auto"/>
+              <w:spacing w:before="10" w:after="10" w:line="240" w:lineRule="auto"/>
             </w:pPr>
           </w:p>
         </w:tc>
@@ -1549,7 +1549,7 @@
           </w:tcPr>
           <w:p>
             <w:pPr>
-              <w:spacing w:before="13" w:after="13" w:line="240" w:lineRule="auto"/>
+              <w:spacing w:before="10" w:after="10" w:line="240" w:lineRule="auto"/>
             </w:pPr>
             <w:r>
               <w:rPr>
@@ -1573,7 +1573,7 @@
           </w:tcPr>
           <w:p>
             <w:pPr>
-              <w:spacing w:before="13" w:after="13" w:line="240" w:lineRule="auto"/>
+              <w:spacing w:before="10" w:after="10" w:line="240" w:lineRule="auto"/>
             </w:pPr>
           </w:p>
         </w:tc>
@@ -1589,7 +1589,7 @@
           </w:tcPr>
           <w:p>
             <w:pPr>
-              <w:spacing w:before="13" w:after="13" w:line="240" w:lineRule="auto"/>
+              <w:spacing w:before="10" w:after="10" w:line="240" w:lineRule="auto"/>
             </w:pPr>
           </w:p>
         </w:tc>
@@ -1605,7 +1605,7 @@
           </w:tcPr>
           <w:p>
             <w:pPr>
-              <w:spacing w:before="13" w:after="13" w:line="240" w:lineRule="auto"/>
+              <w:spacing w:before="10" w:after="10" w:line="240" w:lineRule="auto"/>
             </w:pPr>
           </w:p>
         </w:tc>
@@ -1623,7 +1623,7 @@
           </w:tcPr>
           <w:p>
             <w:pPr>
-              <w:spacing w:before="13" w:after="13" w:line="240" w:lineRule="auto"/>
+              <w:spacing w:before="10" w:after="10" w:line="240" w:lineRule="auto"/>
             </w:pPr>
             <w:r>
               <w:rPr>
@@ -1647,7 +1647,7 @@
           </w:tcPr>
           <w:p>
             <w:pPr>
-              <w:spacing w:before="13" w:after="13" w:line="240" w:lineRule="auto"/>
+              <w:spacing w:before="10" w:after="10" w:line="240" w:lineRule="auto"/>
             </w:pPr>
           </w:p>
         </w:tc>
@@ -1663,7 +1663,7 @@
           </w:tcPr>
           <w:p>
             <w:pPr>
-              <w:spacing w:before="13" w:after="13" w:line="240" w:lineRule="auto"/>
+              <w:spacing w:before="10" w:after="10" w:line="240" w:lineRule="auto"/>
             </w:pPr>
           </w:p>
         </w:tc>
@@ -1679,7 +1679,7 @@
           </w:tcPr>
           <w:p>
             <w:pPr>
-              <w:spacing w:before="13" w:after="13" w:line="240" w:lineRule="auto"/>
+              <w:spacing w:before="10" w:after="10" w:line="240" w:lineRule="auto"/>
             </w:pPr>
           </w:p>
         </w:tc>
@@ -1687,7 +1687,7 @@
     </w:tbl>
     <w:p>
       <w:pPr>
-        <w:spacing w:before="96" w:after="0" w:line="240" w:lineRule="auto"/>
+        <w:spacing w:before="72" w:after="0" w:line="240" w:lineRule="auto"/>
         <w:rPr>
           <w:sz w:val="2"/>
           <w:szCs w:val="2"/>
@@ -1696,7 +1696,7 @@
     </w:p>
     <w:p>
       <w:pPr>
-        <w:spacing w:before="160" w:after="64" w:line="240" w:lineRule="auto"/>
+        <w:spacing w:before="120" w:after="48" w:line="240" w:lineRule="auto"/>
         <w:pBdr>
           <w:bottom w:val="single" w:sz="6" w:space="1" w:color="000000"/>
         </w:pBdr>
@@ -1727,7 +1727,7 @@
     </w:p>
     <w:p>
       <w:pPr>
-        <w:spacing w:before="80" w:after="0" w:line="240" w:lineRule="auto"/>
+        <w:spacing w:before="60" w:after="0" w:line="240" w:lineRule="auto"/>
         <w:rPr>
           <w:sz w:val="2"/>
           <w:szCs w:val="2"/>
@@ -1764,7 +1764,7 @@
           </w:tcPr>
           <w:p>
             <w:pPr>
-              <w:spacing w:before="13" w:after="13" w:line="240" w:lineRule="auto"/>
+              <w:spacing w:before="10" w:after="10" w:line="240" w:lineRule="auto"/>
             </w:pPr>
             <w:r>
               <w:rPr>
@@ -1788,7 +1788,7 @@
           </w:tcPr>
           <w:p>
             <w:pPr>
-              <w:spacing w:before="13" w:after="13" w:line="240" w:lineRule="auto"/>
+              <w:spacing w:before="10" w:after="10" w:line="240" w:lineRule="auto"/>
             </w:pPr>
             <w:r>
               <w:rPr>
@@ -1812,7 +1812,7 @@
           </w:tcPr>
           <w:p>
             <w:pPr>
-              <w:spacing w:before="13" w:after="13" w:line="240" w:lineRule="auto"/>
+              <w:spacing w:before="10" w:after="10" w:line="240" w:lineRule="auto"/>
             </w:pPr>
             <w:r>
               <w:rPr>
@@ -1836,7 +1836,7 @@
           </w:tcPr>
           <w:p>
             <w:pPr>
-              <w:spacing w:before="13" w:after="13" w:line="240" w:lineRule="auto"/>
+              <w:spacing w:before="10" w:after="10" w:line="240" w:lineRule="auto"/>
             </w:pPr>
             <w:r>
               <w:rPr>
@@ -1860,7 +1860,7 @@
           </w:tcPr>
           <w:p>
             <w:pPr>
-              <w:spacing w:before="13" w:after="13" w:line="240" w:lineRule="auto"/>
+              <w:spacing w:before="10" w:after="10" w:line="240" w:lineRule="auto"/>
             </w:pPr>
             <w:r>
               <w:rPr>
@@ -1886,7 +1886,7 @@
           </w:tcPr>
           <w:p>
             <w:pPr>
-              <w:spacing w:before="13" w:after="13" w:line="240" w:lineRule="auto"/>
+              <w:spacing w:before="10" w:after="10" w:line="240" w:lineRule="auto"/>
             </w:pPr>
             <w:r>
               <w:rPr>
@@ -1910,7 +1910,7 @@
           </w:tcPr>
           <w:p>
             <w:pPr>
-              <w:spacing w:before="13" w:after="13" w:line="240" w:lineRule="auto"/>
+              <w:spacing w:before="10" w:after="10" w:line="240" w:lineRule="auto"/>
             </w:pPr>
           </w:p>
         </w:tc>
@@ -1926,7 +1926,7 @@
           </w:tcPr>
           <w:p>
             <w:pPr>
-              <w:spacing w:before="13" w:after="13" w:line="240" w:lineRule="auto"/>
+              <w:spacing w:before="10" w:after="10" w:line="240" w:lineRule="auto"/>
             </w:pPr>
           </w:p>
         </w:tc>
@@ -1942,7 +1942,7 @@
           </w:tcPr>
           <w:p>
             <w:pPr>
-              <w:spacing w:before="13" w:after="13" w:line="240" w:lineRule="auto"/>
+              <w:spacing w:before="10" w:after="10" w:line="240" w:lineRule="auto"/>
             </w:pPr>
           </w:p>
         </w:tc>
@@ -1958,7 +1958,7 @@
           </w:tcPr>
           <w:p>
             <w:pPr>
-              <w:spacing w:before="13" w:after="13" w:line="240" w:lineRule="auto"/>
+              <w:spacing w:before="10" w:after="10" w:line="240" w:lineRule="auto"/>
             </w:pPr>
           </w:p>
         </w:tc>
@@ -1976,7 +1976,7 @@
           </w:tcPr>
           <w:p>
             <w:pPr>
-              <w:spacing w:before="13" w:after="13" w:line="240" w:lineRule="auto"/>
+              <w:spacing w:before="10" w:after="10" w:line="240" w:lineRule="auto"/>
             </w:pPr>
             <w:r>
               <w:rPr>
@@ -2000,7 +2000,7 @@
           </w:tcPr>
           <w:p>
             <w:pPr>
-              <w:spacing w:before="13" w:after="13" w:line="240" w:lineRule="auto"/>
+              <w:spacing w:before="10" w:after="10" w:line="240" w:lineRule="auto"/>
             </w:pPr>
           </w:p>
         </w:tc>
@@ -2016,7 +2016,7 @@
           </w:tcPr>
           <w:p>
             <w:pPr>
-              <w:spacing w:before="13" w:after="13" w:line="240" w:lineRule="auto"/>
+              <w:spacing w:before="10" w:after="10" w:line="240" w:lineRule="auto"/>
             </w:pPr>
           </w:p>
         </w:tc>
@@ -2032,7 +2032,7 @@
           </w:tcPr>
           <w:p>
             <w:pPr>
-              <w:spacing w:before="13" w:after="13" w:line="240" w:lineRule="auto"/>
+              <w:spacing w:before="10" w:after="10" w:line="240" w:lineRule="auto"/>
             </w:pPr>
           </w:p>
         </w:tc>
@@ -2048,7 +2048,7 @@
           </w:tcPr>
           <w:p>
             <w:pPr>
-              <w:spacing w:before="13" w:after="13" w:line="240" w:lineRule="auto"/>
+              <w:spacing w:before="10" w:after="10" w:line="240" w:lineRule="auto"/>
             </w:pPr>
           </w:p>
         </w:tc>
@@ -2066,7 +2066,7 @@
           </w:tcPr>
           <w:p>
             <w:pPr>
-              <w:spacing w:before="13" w:after="13" w:line="240" w:lineRule="auto"/>
+              <w:spacing w:before="10" w:after="10" w:line="240" w:lineRule="auto"/>
             </w:pPr>
             <w:r>
               <w:rPr>
@@ -2090,7 +2090,7 @@
           </w:tcPr>
           <w:p>
             <w:pPr>
-              <w:spacing w:before="13" w:after="13" w:line="240" w:lineRule="auto"/>
+              <w:spacing w:before="10" w:after="10" w:line="240" w:lineRule="auto"/>
             </w:pPr>
           </w:p>
         </w:tc>
@@ -2106,7 +2106,7 @@
           </w:tcPr>
           <w:p>
             <w:pPr>
-              <w:spacing w:before="13" w:after="13" w:line="240" w:lineRule="auto"/>
+              <w:spacing w:before="10" w:after="10" w:line="240" w:lineRule="auto"/>
             </w:pPr>
           </w:p>
         </w:tc>
@@ -2122,7 +2122,7 @@
           </w:tcPr>
           <w:p>
             <w:pPr>
-              <w:spacing w:before="13" w:after="13" w:line="240" w:lineRule="auto"/>
+              <w:spacing w:before="10" w:after="10" w:line="240" w:lineRule="auto"/>
             </w:pPr>
           </w:p>
         </w:tc>
@@ -2138,7 +2138,7 @@
           </w:tcPr>
           <w:p>
             <w:pPr>
-              <w:spacing w:before="13" w:after="13" w:line="240" w:lineRule="auto"/>
+              <w:spacing w:before="10" w:after="10" w:line="240" w:lineRule="auto"/>
             </w:pPr>
           </w:p>
         </w:tc>
@@ -2156,7 +2156,7 @@
           </w:tcPr>
           <w:p>
             <w:pPr>
-              <w:spacing w:before="13" w:after="13" w:line="240" w:lineRule="auto"/>
+              <w:spacing w:before="10" w:after="10" w:line="240" w:lineRule="auto"/>
             </w:pPr>
             <w:r>
               <w:rPr>
@@ -2180,7 +2180,7 @@
           </w:tcPr>
           <w:p>
             <w:pPr>
-              <w:spacing w:before="13" w:after="13" w:line="240" w:lineRule="auto"/>
+              <w:spacing w:before="10" w:after="10" w:line="240" w:lineRule="auto"/>
             </w:pPr>
           </w:p>
         </w:tc>
@@ -2196,7 +2196,7 @@
           </w:tcPr>
           <w:p>
             <w:pPr>
-              <w:spacing w:before="13" w:after="13" w:line="240" w:lineRule="auto"/>
+              <w:spacing w:before="10" w:after="10" w:line="240" w:lineRule="auto"/>
             </w:pPr>
           </w:p>
         </w:tc>
@@ -2212,7 +2212,7 @@
           </w:tcPr>
           <w:p>
             <w:pPr>
-              <w:spacing w:before="13" w:after="13" w:line="240" w:lineRule="auto"/>
+              <w:spacing w:before="10" w:after="10" w:line="240" w:lineRule="auto"/>
             </w:pPr>
           </w:p>
         </w:tc>
@@ -2228,7 +2228,7 @@
           </w:tcPr>
           <w:p>
             <w:pPr>
-              <w:spacing w:before="13" w:after="13" w:line="240" w:lineRule="auto"/>
+              <w:spacing w:before="10" w:after="10" w:line="240" w:lineRule="auto"/>
             </w:pPr>
           </w:p>
         </w:tc>
@@ -2246,7 +2246,7 @@
           </w:tcPr>
           <w:p>
             <w:pPr>
-              <w:spacing w:before="13" w:after="13" w:line="240" w:lineRule="auto"/>
+              <w:spacing w:before="10" w:after="10" w:line="240" w:lineRule="auto"/>
             </w:pPr>
             <w:r>
               <w:rPr>
@@ -2270,7 +2270,7 @@
           </w:tcPr>
           <w:p>
             <w:pPr>
-              <w:spacing w:before="13" w:after="13" w:line="240" w:lineRule="auto"/>
+              <w:spacing w:before="10" w:after="10" w:line="240" w:lineRule="auto"/>
             </w:pPr>
           </w:p>
         </w:tc>
@@ -2286,7 +2286,7 @@
           </w:tcPr>
           <w:p>
             <w:pPr>
-              <w:spacing w:before="13" w:after="13" w:line="240" w:lineRule="auto"/>
+              <w:spacing w:before="10" w:after="10" w:line="240" w:lineRule="auto"/>
             </w:pPr>
           </w:p>
         </w:tc>
@@ -2302,7 +2302,7 @@
           </w:tcPr>
           <w:p>
             <w:pPr>
-              <w:spacing w:before="13" w:after="13" w:line="240" w:lineRule="auto"/>
+              <w:spacing w:before="10" w:after="10" w:line="240" w:lineRule="auto"/>
             </w:pPr>
           </w:p>
         </w:tc>
@@ -2318,7 +2318,7 @@
           </w:tcPr>
           <w:p>
             <w:pPr>
-              <w:spacing w:before="13" w:after="13" w:line="240" w:lineRule="auto"/>
+              <w:spacing w:before="10" w:after="10" w:line="240" w:lineRule="auto"/>
             </w:pPr>
           </w:p>
         </w:tc>
@@ -2336,7 +2336,7 @@
           </w:tcPr>
           <w:p>
             <w:pPr>
-              <w:spacing w:before="13" w:after="13" w:line="240" w:lineRule="auto"/>
+              <w:spacing w:before="10" w:after="10" w:line="240" w:lineRule="auto"/>
             </w:pPr>
             <w:r>
               <w:rPr>
@@ -2360,7 +2360,7 @@
           </w:tcPr>
           <w:p>
             <w:pPr>
-              <w:spacing w:before="13" w:after="13" w:line="240" w:lineRule="auto"/>
+              <w:spacing w:before="10" w:after="10" w:line="240" w:lineRule="auto"/>
             </w:pPr>
           </w:p>
         </w:tc>
@@ -2376,7 +2376,7 @@
           </w:tcPr>
           <w:p>
             <w:pPr>
-              <w:spacing w:before="13" w:after="13" w:line="240" w:lineRule="auto"/>
+              <w:spacing w:before="10" w:after="10" w:line="240" w:lineRule="auto"/>
             </w:pPr>
           </w:p>
         </w:tc>
@@ -2392,7 +2392,7 @@
           </w:tcPr>
           <w:p>
             <w:pPr>
-              <w:spacing w:before="13" w:after="13" w:line="240" w:lineRule="auto"/>
+              <w:spacing w:before="10" w:after="10" w:line="240" w:lineRule="auto"/>
             </w:pPr>
           </w:p>
         </w:tc>
@@ -2408,7 +2408,7 @@
           </w:tcPr>
           <w:p>
             <w:pPr>
-              <w:spacing w:before="13" w:after="13" w:line="240" w:lineRule="auto"/>
+              <w:spacing w:before="10" w:after="10" w:line="240" w:lineRule="auto"/>
             </w:pPr>
           </w:p>
         </w:tc>
@@ -2426,7 +2426,7 @@
           </w:tcPr>
           <w:p>
             <w:pPr>
-              <w:spacing w:before="13" w:after="13" w:line="240" w:lineRule="auto"/>
+              <w:spacing w:before="10" w:after="10" w:line="240" w:lineRule="auto"/>
             </w:pPr>
             <w:r>
               <w:rPr>
@@ -2450,7 +2450,7 @@
           </w:tcPr>
           <w:p>
             <w:pPr>
-              <w:spacing w:before="13" w:after="13" w:line="240" w:lineRule="auto"/>
+              <w:spacing w:before="10" w:after="10" w:line="240" w:lineRule="auto"/>
             </w:pPr>
           </w:p>
         </w:tc>
@@ -2466,7 +2466,7 @@
           </w:tcPr>
           <w:p>
             <w:pPr>
-              <w:spacing w:before="13" w:after="13" w:line="240" w:lineRule="auto"/>
+              <w:spacing w:before="10" w:after="10" w:line="240" w:lineRule="auto"/>
             </w:pPr>
           </w:p>
         </w:tc>
@@ -2482,7 +2482,7 @@
           </w:tcPr>
           <w:p>
             <w:pPr>
-              <w:spacing w:before="13" w:after="13" w:line="240" w:lineRule="auto"/>
+              <w:spacing w:before="10" w:after="10" w:line="240" w:lineRule="auto"/>
             </w:pPr>
           </w:p>
         </w:tc>
@@ -2498,7 +2498,7 @@
           </w:tcPr>
           <w:p>
             <w:pPr>
-              <w:spacing w:before="13" w:after="13" w:line="240" w:lineRule="auto"/>
+              <w:spacing w:before="10" w:after="10" w:line="240" w:lineRule="auto"/>
             </w:pPr>
           </w:p>
         </w:tc>
@@ -2516,7 +2516,7 @@
           </w:tcPr>
           <w:p>
             <w:pPr>
-              <w:spacing w:before="13" w:after="13" w:line="240" w:lineRule="auto"/>
+              <w:spacing w:before="10" w:after="10" w:line="240" w:lineRule="auto"/>
             </w:pPr>
             <w:r>
               <w:rPr>
@@ -2540,7 +2540,7 @@
           </w:tcPr>
           <w:p>
             <w:pPr>
-              <w:spacing w:before="13" w:after="13" w:line="240" w:lineRule="auto"/>
+              <w:spacing w:before="10" w:after="10" w:line="240" w:lineRule="auto"/>
             </w:pPr>
           </w:p>
         </w:tc>
@@ -2556,7 +2556,7 @@
           </w:tcPr>
           <w:p>
             <w:pPr>
-              <w:spacing w:before="13" w:after="13" w:line="240" w:lineRule="auto"/>
+              <w:spacing w:before="10" w:after="10" w:line="240" w:lineRule="auto"/>
             </w:pPr>
           </w:p>
         </w:tc>
@@ -2572,7 +2572,7 @@
           </w:tcPr>
           <w:p>
             <w:pPr>
-              <w:spacing w:before="13" w:after="13" w:line="240" w:lineRule="auto"/>
+              <w:spacing w:before="10" w:after="10" w:line="240" w:lineRule="auto"/>
             </w:pPr>
           </w:p>
         </w:tc>
@@ -2588,7 +2588,7 @@
           </w:tcPr>
           <w:p>
             <w:pPr>
-              <w:spacing w:before="13" w:after="13" w:line="240" w:lineRule="auto"/>
+              <w:spacing w:before="10" w:after="10" w:line="240" w:lineRule="auto"/>
             </w:pPr>
           </w:p>
         </w:tc>
@@ -2596,7 +2596,7 @@
     </w:tbl>
     <w:p>
       <w:pPr>
-        <w:spacing w:before="96" w:after="0" w:line="240" w:lineRule="auto"/>
+        <w:spacing w:before="72" w:after="0" w:line="240" w:lineRule="auto"/>
         <w:rPr>
           <w:sz w:val="2"/>
           <w:szCs w:val="2"/>
@@ -2605,7 +2605,7 @@
     </w:p>
     <w:p>
       <w:pPr>
-        <w:spacing w:before="160" w:after="64" w:line="240" w:lineRule="auto"/>
+        <w:spacing w:before="120" w:after="48" w:line="240" w:lineRule="auto"/>
         <w:pBdr>
           <w:bottom w:val="single" w:sz="6" w:space="1" w:color="000000"/>
         </w:pBdr>
@@ -2636,7 +2636,7 @@
     </w:p>
     <w:p>
       <w:pPr>
-        <w:spacing w:before="80" w:after="0" w:line="240" w:lineRule="auto"/>
+        <w:spacing w:before="60" w:after="0" w:line="240" w:lineRule="auto"/>
         <w:rPr>
           <w:sz w:val="2"/>
           <w:szCs w:val="2"/>
@@ -2671,7 +2671,7 @@
           </w:tcPr>
           <w:p>
             <w:pPr>
-              <w:spacing w:before="13" w:after="13" w:line="240" w:lineRule="auto"/>
+              <w:spacing w:before="10" w:after="10" w:line="240" w:lineRule="auto"/>
             </w:pPr>
             <w:r>
               <w:rPr>
@@ -2695,7 +2695,7 @@
           </w:tcPr>
           <w:p>
             <w:pPr>
-              <w:spacing w:before="13" w:after="13" w:line="240" w:lineRule="auto"/>
+              <w:spacing w:before="10" w:after="10" w:line="240" w:lineRule="auto"/>
             </w:pPr>
             <w:r>
               <w:rPr>
@@ -2719,7 +2719,7 @@
           </w:tcPr>
           <w:p>
             <w:pPr>
-              <w:spacing w:before="13" w:after="13" w:line="240" w:lineRule="auto"/>
+              <w:spacing w:before="10" w:after="10" w:line="240" w:lineRule="auto"/>
             </w:pPr>
             <w:r>
               <w:rPr>
@@ -2745,7 +2745,7 @@
           </w:tcPr>
           <w:p>
             <w:pPr>
-              <w:spacing w:before="13" w:after="13" w:line="240" w:lineRule="auto"/>
+              <w:spacing w:before="10" w:after="10" w:line="240" w:lineRule="auto"/>
             </w:pPr>
           </w:p>
         </w:tc>
@@ -2761,7 +2761,7 @@
           </w:tcPr>
           <w:p>
             <w:pPr>
-              <w:spacing w:before="13" w:after="13" w:line="240" w:lineRule="auto"/>
+              <w:spacing w:before="10" w:after="10" w:line="240" w:lineRule="auto"/>
             </w:pPr>
           </w:p>
         </w:tc>
@@ -2777,7 +2777,7 @@
           </w:tcPr>
           <w:p>
             <w:pPr>
-              <w:spacing w:before="13" w:after="13" w:line="240" w:lineRule="auto"/>
+              <w:spacing w:before="10" w:after="10" w:line="240" w:lineRule="auto"/>
             </w:pPr>
           </w:p>
         </w:tc>
@@ -2795,7 +2795,7 @@
           </w:tcPr>
           <w:p>
             <w:pPr>
-              <w:spacing w:before="13" w:after="13" w:line="240" w:lineRule="auto"/>
+              <w:spacing w:before="10" w:after="10" w:line="240" w:lineRule="auto"/>
             </w:pPr>
             <w:r>
               <w:rPr>
@@ -2819,7 +2819,7 @@
           </w:tcPr>
           <w:p>
             <w:pPr>
-              <w:spacing w:before="13" w:after="13" w:line="240" w:lineRule="auto"/>
+              <w:spacing w:before="10" w:after="10" w:line="240" w:lineRule="auto"/>
             </w:pPr>
             <w:r>
               <w:rPr>
@@ -2843,7 +2843,7 @@
           </w:tcPr>
           <w:p>
             <w:pPr>
-              <w:spacing w:before="13" w:after="13" w:line="240" w:lineRule="auto"/>
+              <w:spacing w:before="10" w:after="10" w:line="240" w:lineRule="auto"/>
             </w:pPr>
             <w:r>
               <w:rPr>
@@ -2859,7 +2859,7 @@
     </w:tbl>
     <w:p>
       <w:pPr>
-        <w:spacing w:before="96" w:after="0" w:line="240" w:lineRule="auto"/>
+        <w:spacing w:before="72" w:after="0" w:line="240" w:lineRule="auto"/>
         <w:rPr>
           <w:sz w:val="2"/>
           <w:szCs w:val="2"/>
@@ -2868,7 +2868,7 @@
     </w:p>
     <w:p>
       <w:pPr>
-        <w:spacing w:before="96" w:after="0" w:line="240" w:lineRule="auto"/>
+        <w:spacing w:before="72" w:after="0" w:line="240" w:lineRule="auto"/>
       </w:pPr>
       <w:r>
         <w:rPr>
@@ -2881,7 +2881,7 @@
     </w:p>
     <w:p>
       <w:pPr>
-        <w:spacing w:before="160" w:after="64" w:line="240" w:lineRule="auto"/>
+        <w:spacing w:before="120" w:after="48" w:line="240" w:lineRule="auto"/>
         <w:pBdr>
           <w:bottom w:val="single" w:sz="6" w:space="1" w:color="000000"/>
         </w:pBdr>
@@ -2899,7 +2899,7 @@
     </w:p>
     <w:p>
       <w:pPr>
-        <w:spacing w:before="80" w:after="0" w:line="240" w:lineRule="auto"/>
+        <w:spacing w:before="60" w:after="0" w:line="240" w:lineRule="auto"/>
         <w:rPr>
           <w:sz w:val="2"/>
           <w:szCs w:val="2"/>
@@ -2935,7 +2935,7 @@
           </w:tcPr>
           <w:p>
             <w:pPr>
-              <w:spacing w:before="13" w:after="13" w:line="240" w:lineRule="auto"/>
+              <w:spacing w:before="10" w:after="10" w:line="240" w:lineRule="auto"/>
             </w:pPr>
             <w:r>
               <w:rPr>
@@ -2959,7 +2959,7 @@
           </w:tcPr>
           <w:p>
             <w:pPr>
-              <w:spacing w:before="13" w:after="13" w:line="240" w:lineRule="auto"/>
+              <w:spacing w:before="10" w:after="10" w:line="240" w:lineRule="auto"/>
             </w:pPr>
             <w:r>
               <w:rPr>
@@ -2983,7 +2983,7 @@
           </w:tcPr>
           <w:p>
             <w:pPr>
-              <w:spacing w:before="13" w:after="13" w:line="240" w:lineRule="auto"/>
+              <w:spacing w:before="10" w:after="10" w:line="240" w:lineRule="auto"/>
             </w:pPr>
             <w:r>
               <w:rPr>
@@ -3007,7 +3007,7 @@
           </w:tcPr>
           <w:p>
             <w:pPr>
-              <w:spacing w:before="13" w:after="13" w:line="240" w:lineRule="auto"/>
+              <w:spacing w:before="10" w:after="10" w:line="240" w:lineRule="auto"/>
             </w:pPr>
             <w:r>
               <w:rPr>
@@ -3033,7 +3033,7 @@
           </w:tcPr>
           <w:p>
             <w:pPr>
-              <w:spacing w:before="13" w:after="13" w:line="240" w:lineRule="auto"/>
+              <w:spacing w:before="10" w:after="10" w:line="240" w:lineRule="auto"/>
             </w:pPr>
             <w:r>
               <w:rPr>
@@ -3057,7 +3057,7 @@
           </w:tcPr>
           <w:p>
             <w:pPr>
-              <w:spacing w:before="13" w:after="13" w:line="240" w:lineRule="auto"/>
+              <w:spacing w:before="10" w:after="10" w:line="240" w:lineRule="auto"/>
             </w:pPr>
           </w:p>
         </w:tc>
@@ -3073,7 +3073,7 @@
           </w:tcPr>
           <w:p>
             <w:pPr>
-              <w:spacing w:before="13" w:after="13" w:line="240" w:lineRule="auto"/>
+              <w:spacing w:before="10" w:after="10" w:line="240" w:lineRule="auto"/>
             </w:pPr>
           </w:p>
         </w:tc>
@@ -3089,7 +3089,7 @@
           </w:tcPr>
           <w:p>
             <w:pPr>
-              <w:spacing w:before="13" w:after="13" w:line="240" w:lineRule="auto"/>
+              <w:spacing w:before="10" w:after="10" w:line="240" w:lineRule="auto"/>
             </w:pPr>
           </w:p>
         </w:tc>
@@ -3107,7 +3107,7 @@
           </w:tcPr>
           <w:p>
             <w:pPr>
-              <w:spacing w:before="13" w:after="13" w:line="240" w:lineRule="auto"/>
+              <w:spacing w:before="10" w:after="10" w:line="240" w:lineRule="auto"/>
             </w:pPr>
             <w:r>
               <w:rPr>
@@ -3131,7 +3131,7 @@
           </w:tcPr>
           <w:p>
             <w:pPr>
-              <w:spacing w:before="13" w:after="13" w:line="240" w:lineRule="auto"/>
+              <w:spacing w:before="10" w:after="10" w:line="240" w:lineRule="auto"/>
             </w:pPr>
           </w:p>
         </w:tc>
@@ -3147,7 +3147,7 @@
           </w:tcPr>
           <w:p>
             <w:pPr>
-              <w:spacing w:before="13" w:after="13" w:line="240" w:lineRule="auto"/>
+              <w:spacing w:before="10" w:after="10" w:line="240" w:lineRule="auto"/>
             </w:pPr>
           </w:p>
         </w:tc>
@@ -3163,7 +3163,7 @@
           </w:tcPr>
           <w:p>
             <w:pPr>
-              <w:spacing w:before="13" w:after="13" w:line="240" w:lineRule="auto"/>
+              <w:spacing w:before="10" w:after="10" w:line="240" w:lineRule="auto"/>
             </w:pPr>
           </w:p>
         </w:tc>
@@ -3181,7 +3181,7 @@
           </w:tcPr>
           <w:p>
             <w:pPr>
-              <w:spacing w:before="13" w:after="13" w:line="240" w:lineRule="auto"/>
+              <w:spacing w:before="10" w:after="10" w:line="240" w:lineRule="auto"/>
             </w:pPr>
             <w:r>
               <w:rPr>
@@ -3205,7 +3205,7 @@
           </w:tcPr>
           <w:p>
             <w:pPr>
-              <w:spacing w:before="13" w:after="13" w:line="240" w:lineRule="auto"/>
+              <w:spacing w:before="10" w:after="10" w:line="240" w:lineRule="auto"/>
             </w:pPr>
           </w:p>
         </w:tc>
@@ -3221,7 +3221,7 @@
           </w:tcPr>
           <w:p>
             <w:pPr>
-              <w:spacing w:before="13" w:after="13" w:line="240" w:lineRule="auto"/>
+              <w:spacing w:before="10" w:after="10" w:line="240" w:lineRule="auto"/>
             </w:pPr>
           </w:p>
         </w:tc>
@@ -3237,7 +3237,7 @@
           </w:tcPr>
           <w:p>
             <w:pPr>
-              <w:spacing w:before="13" w:after="13" w:line="240" w:lineRule="auto"/>
+              <w:spacing w:before="10" w:after="10" w:line="240" w:lineRule="auto"/>
             </w:pPr>
           </w:p>
         </w:tc>
@@ -3255,7 +3255,7 @@
           </w:tcPr>
           <w:p>
             <w:pPr>
-              <w:spacing w:before="13" w:after="13" w:line="240" w:lineRule="auto"/>
+              <w:spacing w:before="10" w:after="10" w:line="240" w:lineRule="auto"/>
             </w:pPr>
             <w:r>
               <w:rPr>
@@ -3279,7 +3279,7 @@
           </w:tcPr>
           <w:p>
             <w:pPr>
-              <w:spacing w:before="13" w:after="13" w:line="240" w:lineRule="auto"/>
+              <w:spacing w:before="10" w:after="10" w:line="240" w:lineRule="auto"/>
             </w:pPr>
           </w:p>
         </w:tc>
@@ -3295,7 +3295,7 @@
           </w:tcPr>
           <w:p>
             <w:pPr>
-              <w:spacing w:before="13" w:after="13" w:line="240" w:lineRule="auto"/>
+              <w:spacing w:before="10" w:after="10" w:line="240" w:lineRule="auto"/>
             </w:pPr>
           </w:p>
         </w:tc>
@@ -3311,7 +3311,7 @@
           </w:tcPr>
           <w:p>
             <w:pPr>
-              <w:spacing w:before="13" w:after="13" w:line="240" w:lineRule="auto"/>
+              <w:spacing w:before="10" w:after="10" w:line="240" w:lineRule="auto"/>
             </w:pPr>
           </w:p>
         </w:tc>
@@ -3329,7 +3329,7 @@
           </w:tcPr>
           <w:p>
             <w:pPr>
-              <w:spacing w:before="13" w:after="13" w:line="240" w:lineRule="auto"/>
+              <w:spacing w:before="10" w:after="10" w:line="240" w:lineRule="auto"/>
             </w:pPr>
             <w:r>
               <w:rPr>
@@ -3353,7 +3353,7 @@
           </w:tcPr>
           <w:p>
             <w:pPr>
-              <w:spacing w:before="13" w:after="13" w:line="240" w:lineRule="auto"/>
+              <w:spacing w:before="10" w:after="10" w:line="240" w:lineRule="auto"/>
             </w:pPr>
           </w:p>
         </w:tc>
@@ -3369,7 +3369,7 @@
           </w:tcPr>
           <w:p>
             <w:pPr>
-              <w:spacing w:before="13" w:after="13" w:line="240" w:lineRule="auto"/>
+              <w:spacing w:before="10" w:after="10" w:line="240" w:lineRule="auto"/>
             </w:pPr>
           </w:p>
         </w:tc>
@@ -3385,7 +3385,7 @@
           </w:tcPr>
           <w:p>
             <w:pPr>
-              <w:spacing w:before="13" w:after="13" w:line="240" w:lineRule="auto"/>
+              <w:spacing w:before="10" w:after="10" w:line="240" w:lineRule="auto"/>
             </w:pPr>
           </w:p>
         </w:tc>
@@ -3393,7 +3393,7 @@
     </w:tbl>
     <w:p>
       <w:pPr>
-        <w:spacing w:before="96" w:after="0" w:line="240" w:lineRule="auto"/>
+        <w:spacing w:before="72" w:after="0" w:line="240" w:lineRule="auto"/>
         <w:rPr>
           <w:sz w:val="2"/>
           <w:szCs w:val="2"/>
@@ -3402,7 +3402,7 @@
     </w:p>
     <w:p>
       <w:pPr>
-        <w:spacing w:before="96" w:after="0" w:line="240" w:lineRule="auto"/>
+        <w:spacing w:before="72" w:after="0" w:line="240" w:lineRule="auto"/>
       </w:pPr>
       <w:r>
         <w:rPr>
@@ -3415,7 +3415,7 @@
     </w:p>
     <w:p>
       <w:pPr>
-        <w:spacing w:before="160" w:after="64" w:line="240" w:lineRule="auto"/>
+        <w:spacing w:before="120" w:after="48" w:line="240" w:lineRule="auto"/>
         <w:pBdr>
           <w:bottom w:val="single" w:sz="6" w:space="1" w:color="000000"/>
         </w:pBdr>
@@ -3446,7 +3446,7 @@
     </w:p>
     <w:p>
       <w:pPr>
-        <w:spacing w:before="160" w:after="64" w:line="240" w:lineRule="auto"/>
+        <w:spacing w:before="120" w:after="48" w:line="240" w:lineRule="auto"/>
         <w:pBdr>
           <w:bottom w:val="single" w:sz="6" w:space="1" w:color="000000"/>
         </w:pBdr>
@@ -3477,7 +3477,7 @@
     </w:p>
     <w:p>
       <w:pPr>
-        <w:spacing w:before="80" w:after="0" w:line="240" w:lineRule="auto"/>
+        <w:spacing w:before="60" w:after="0" w:line="240" w:lineRule="auto"/>
         <w:rPr>
           <w:sz w:val="2"/>
           <w:szCs w:val="2"/>
@@ -3511,7 +3511,7 @@
           </w:tcPr>
           <w:p>
             <w:pPr>
-              <w:spacing w:before="13" w:after="13" w:line="240" w:lineRule="auto"/>
+              <w:spacing w:before="10" w:after="10" w:line="240" w:lineRule="auto"/>
             </w:pPr>
             <w:r>
               <w:rPr>
@@ -3535,7 +3535,7 @@
           </w:tcPr>
           <w:p>
             <w:pPr>
-              <w:spacing w:before="13" w:after="13" w:line="240" w:lineRule="auto"/>
+              <w:spacing w:before="10" w:after="10" w:line="240" w:lineRule="auto"/>
             </w:pPr>
             <w:r>
               <w:rPr>
@@ -3561,7 +3561,7 @@
           </w:tcPr>
           <w:p>
             <w:pPr>
-              <w:spacing w:before="13" w:after="13" w:line="240" w:lineRule="auto"/>
+              <w:spacing w:before="10" w:after="10" w:line="240" w:lineRule="auto"/>
             </w:pPr>
             <w:r>
               <w:rPr>
@@ -3585,7 +3585,7 @@
           </w:tcPr>
           <w:p>
             <w:pPr>
-              <w:spacing w:before="13" w:after="13" w:line="240" w:lineRule="auto"/>
+              <w:spacing w:before="10" w:after="10" w:line="240" w:lineRule="auto"/>
             </w:pPr>
             <w:r>
               <w:rPr>
@@ -3611,7 +3611,7 @@
           </w:tcPr>
           <w:p>
             <w:pPr>
-              <w:spacing w:before="13" w:after="13" w:line="240" w:lineRule="auto"/>
+              <w:spacing w:before="10" w:after="10" w:line="240" w:lineRule="auto"/>
             </w:pPr>
             <w:r>
               <w:rPr>
@@ -3635,7 +3635,7 @@
           </w:tcPr>
           <w:p>
             <w:pPr>
-              <w:spacing w:before="13" w:after="13" w:line="240" w:lineRule="auto"/>
+              <w:spacing w:before="10" w:after="10" w:line="240" w:lineRule="auto"/>
             </w:pPr>
             <w:r>
               <w:rPr>
@@ -3661,7 +3661,7 @@
           </w:tcPr>
           <w:p>
             <w:pPr>
-              <w:spacing w:before="13" w:after="13" w:line="240" w:lineRule="auto"/>
+              <w:spacing w:before="10" w:after="10" w:line="240" w:lineRule="auto"/>
             </w:pPr>
             <w:r>
               <w:rPr>
@@ -3685,7 +3685,7 @@
           </w:tcPr>
           <w:p>
             <w:pPr>
-              <w:spacing w:before="13" w:after="13" w:line="240" w:lineRule="auto"/>
+              <w:spacing w:before="10" w:after="10" w:line="240" w:lineRule="auto"/>
             </w:pPr>
             <w:r>
               <w:rPr>
@@ -3711,7 +3711,7 @@
           </w:tcPr>
           <w:p>
             <w:pPr>
-              <w:spacing w:before="13" w:after="13" w:line="240" w:lineRule="auto"/>
+              <w:spacing w:before="10" w:after="10" w:line="240" w:lineRule="auto"/>
             </w:pPr>
             <w:r>
               <w:rPr>
@@ -3735,7 +3735,7 @@
           </w:tcPr>
           <w:p>
             <w:pPr>
-              <w:spacing w:before="13" w:after="13" w:line="240" w:lineRule="auto"/>
+              <w:spacing w:before="10" w:after="10" w:line="240" w:lineRule="auto"/>
             </w:pPr>
             <w:r>
               <w:rPr>
@@ -3761,7 +3761,7 @@
           </w:tcPr>
           <w:p>
             <w:pPr>
-              <w:spacing w:before="13" w:after="13" w:line="240" w:lineRule="auto"/>
+              <w:spacing w:before="10" w:after="10" w:line="240" w:lineRule="auto"/>
             </w:pPr>
             <w:r>
               <w:rPr>
@@ -3785,7 +3785,7 @@
           </w:tcPr>
           <w:p>
             <w:pPr>
-              <w:spacing w:before="13" w:after="13" w:line="240" w:lineRule="auto"/>
+              <w:spacing w:before="10" w:after="10" w:line="240" w:lineRule="auto"/>
             </w:pPr>
             <w:r>
               <w:rPr>
@@ -3811,7 +3811,7 @@
           </w:tcPr>
           <w:p>
             <w:pPr>
-              <w:spacing w:before="13" w:after="13" w:line="240" w:lineRule="auto"/>
+              <w:spacing w:before="10" w:after="10" w:line="240" w:lineRule="auto"/>
             </w:pPr>
             <w:r>
               <w:rPr>
@@ -3835,7 +3835,7 @@
           </w:tcPr>
           <w:p>
             <w:pPr>
-              <w:spacing w:before="13" w:after="13" w:line="240" w:lineRule="auto"/>
+              <w:spacing w:before="10" w:after="10" w:line="240" w:lineRule="auto"/>
             </w:pPr>
             <w:r>
               <w:rPr>
@@ -3861,7 +3861,7 @@
           </w:tcPr>
           <w:p>
             <w:pPr>
-              <w:spacing w:before="13" w:after="13" w:line="240" w:lineRule="auto"/>
+              <w:spacing w:before="10" w:after="10" w:line="240" w:lineRule="auto"/>
             </w:pPr>
             <w:r>
               <w:rPr>
@@ -3885,7 +3885,7 @@
           </w:tcPr>
           <w:p>
             <w:pPr>
-              <w:spacing w:before="13" w:after="13" w:line="240" w:lineRule="auto"/>
+              <w:spacing w:before="10" w:after="10" w:line="240" w:lineRule="auto"/>
             </w:pPr>
             <w:r>
               <w:rPr>
@@ -3911,7 +3911,7 @@
           </w:tcPr>
           <w:p>
             <w:pPr>
-              <w:spacing w:before="13" w:after="13" w:line="240" w:lineRule="auto"/>
+              <w:spacing w:before="10" w:after="10" w:line="240" w:lineRule="auto"/>
             </w:pPr>
             <w:r>
               <w:rPr>
@@ -3935,7 +3935,7 @@
           </w:tcPr>
           <w:p>
             <w:pPr>
-              <w:spacing w:before="13" w:after="13" w:line="240" w:lineRule="auto"/>
+              <w:spacing w:before="10" w:after="10" w:line="240" w:lineRule="auto"/>
             </w:pPr>
             <w:r>
               <w:rPr>
@@ -3961,7 +3961,7 @@
           </w:tcPr>
           <w:p>
             <w:pPr>
-              <w:spacing w:before="13" w:after="13" w:line="240" w:lineRule="auto"/>
+              <w:spacing w:before="10" w:after="10" w:line="240" w:lineRule="auto"/>
             </w:pPr>
             <w:r>
               <w:rPr>
@@ -3985,7 +3985,7 @@
           </w:tcPr>
           <w:p>
             <w:pPr>
-              <w:spacing w:before="13" w:after="13" w:line="240" w:lineRule="auto"/>
+              <w:spacing w:before="10" w:after="10" w:line="240" w:lineRule="auto"/>
             </w:pPr>
             <w:r>
               <w:rPr>
@@ -4011,7 +4011,7 @@
           </w:tcPr>
           <w:p>
             <w:pPr>
-              <w:spacing w:before="13" w:after="13" w:line="240" w:lineRule="auto"/>
+              <w:spacing w:before="10" w:after="10" w:line="240" w:lineRule="auto"/>
             </w:pPr>
             <w:r>
               <w:rPr>
@@ -4035,7 +4035,7 @@
           </w:tcPr>
           <w:p>
             <w:pPr>
-              <w:spacing w:before="13" w:after="13" w:line="240" w:lineRule="auto"/>
+              <w:spacing w:before="10" w:after="10" w:line="240" w:lineRule="auto"/>
             </w:pPr>
             <w:r>
               <w:rPr>
@@ -4051,7 +4051,7 @@
     </w:tbl>
     <w:p>
       <w:pPr>
-        <w:spacing w:before="96" w:after="0" w:line="240" w:lineRule="auto"/>
+        <w:spacing w:before="72" w:after="0" w:line="240" w:lineRule="auto"/>
         <w:rPr>
           <w:sz w:val="2"/>
           <w:szCs w:val="2"/>
@@ -4060,7 +4060,7 @@
     </w:p>
     <w:p>
       <w:pPr>
-        <w:spacing w:before="96" w:after="0" w:line="240" w:lineRule="auto"/>
+        <w:spacing w:before="72" w:after="0" w:line="240" w:lineRule="auto"/>
       </w:pPr>
       <w:r>
         <w:rPr>
@@ -4073,7 +4073,7 @@
     </w:p>
     <w:p>
       <w:pPr>
-        <w:spacing w:before="160" w:after="64" w:line="240" w:lineRule="auto"/>
+        <w:spacing w:before="120" w:after="48" w:line="240" w:lineRule="auto"/>
         <w:pBdr>
           <w:bottom w:val="single" w:sz="6" w:space="1" w:color="000000"/>
         </w:pBdr>
@@ -4091,7 +4091,7 @@
     </w:p>
     <w:p>
       <w:pPr>
-        <w:spacing w:before="80" w:after="0" w:line="240" w:lineRule="auto"/>
+        <w:spacing w:before="60" w:after="0" w:line="240" w:lineRule="auto"/>
         <w:rPr>
           <w:sz w:val="2"/>
           <w:szCs w:val="2"/>
@@ -4126,7 +4126,7 @@
           </w:tcPr>
           <w:p>
             <w:pPr>
-              <w:spacing w:before="13" w:after="13" w:line="240" w:lineRule="auto"/>
+              <w:spacing w:before="10" w:after="10" w:line="240" w:lineRule="auto"/>
             </w:pPr>
             <w:r>
               <w:rPr>
@@ -4150,7 +4150,7 @@
           </w:tcPr>
           <w:p>
             <w:pPr>
-              <w:spacing w:before="13" w:after="13" w:line="240" w:lineRule="auto"/>
+              <w:spacing w:before="10" w:after="10" w:line="240" w:lineRule="auto"/>
             </w:pPr>
             <w:r>
               <w:rPr>
@@ -4174,7 +4174,7 @@
           </w:tcPr>
           <w:p>
             <w:pPr>
-              <w:spacing w:before="13" w:after="13" w:line="240" w:lineRule="auto"/>
+              <w:spacing w:before="10" w:after="10" w:line="240" w:lineRule="auto"/>
             </w:pPr>
             <w:r>
               <w:rPr>
@@ -4200,7 +4200,7 @@
           </w:tcPr>
           <w:p>
             <w:pPr>
-              <w:spacing w:before="13" w:after="13" w:line="240" w:lineRule="auto"/>
+              <w:spacing w:before="10" w:after="10" w:line="240" w:lineRule="auto"/>
             </w:pPr>
           </w:p>
         </w:tc>
@@ -4216,7 +4216,7 @@
           </w:tcPr>
           <w:p>
             <w:pPr>
-              <w:spacing w:before="13" w:after="13" w:line="240" w:lineRule="auto"/>
+              <w:spacing w:before="10" w:after="10" w:line="240" w:lineRule="auto"/>
             </w:pPr>
           </w:p>
         </w:tc>
@@ -4232,7 +4232,7 @@
           </w:tcPr>
           <w:p>
             <w:pPr>
-              <w:spacing w:before="13" w:after="13" w:line="240" w:lineRule="auto"/>
+              <w:spacing w:before="10" w:after="10" w:line="240" w:lineRule="auto"/>
             </w:pPr>
           </w:p>
         </w:tc>
@@ -4240,7 +4240,7 @@
     </w:tbl>
     <w:p>
       <w:pPr>
-        <w:spacing w:before="96" w:after="0" w:line="240" w:lineRule="auto"/>
+        <w:spacing w:before="72" w:after="0" w:line="240" w:lineRule="auto"/>
         <w:rPr>
           <w:sz w:val="2"/>
           <w:szCs w:val="2"/>
@@ -4249,7 +4249,38 @@
     </w:p>
     <w:p>
       <w:pPr>
-        <w:spacing w:before="160" w:after="64" w:line="240" w:lineRule="auto"/>
+        <w:spacing w:before="120" w:after="48" w:line="240" w:lineRule="auto"/>
+        <w:pBdr>
+          <w:bottom w:val="single" w:sz="6" w:space="1" w:color="000000"/>
+        </w:pBdr>
+        <w:keepNext/>
+      </w:pPr>
+      <w:r>
+        <w:rPr>
+          <w:rFonts w:ascii="Calibri" w:hAnsi="Calibri"/>
+          <w:b/>
+          <w:sz w:val="21"/>
+          <w:spacing w:val="20"/>
+        </w:rPr>
+        <w:t>8. The read before the draft, fields carrying the prefix `prepick.`</w:t>
+      </w:r>
+    </w:p>
+    <w:p>
+      <w:pPr>
+        <w:spacing w:before="0" w:after="0" w:line="240" w:lineRule="auto"/>
+      </w:pPr>
+      <w:r>
+        <w:rPr>
+          <w:rFonts w:ascii="Calibri" w:hAnsi="Calibri"/>
+          <w:b w:val="0"/>
+          <w:sz w:val="21"/>
+        </w:rPr>
+        <w:t>Each player taps, from the ledger alone and before any AI draft, the lines worth a second look. First attempts with that read prepick.first_attempts_with_read, and with a final call moved off it prepick.first_attempts_changed_any. Lines compared prepick.lines_compared, moved prepick.lines_changed, toward the key prepick.changed_toward_key, away from it prepick.changed_away_from_key, held prepick.lines_held. Descriptive agreement on a keyed exercise, never a learning gain.</w:t>
+      </w:r>
+    </w:p>
+    <w:p>
+      <w:pPr>
+        <w:spacing w:before="120" w:after="48" w:line="240" w:lineRule="auto"/>
         <w:pBdr>
           <w:bottom w:val="single" w:sz="6" w:space="1" w:color="000000"/>
         </w:pBdr>
@@ -4280,7 +4311,7 @@
     </w:p>
     <w:p>
       <w:pPr>
-        <w:spacing w:before="160" w:after="64" w:line="240" w:lineRule="auto"/>
+        <w:spacing w:before="120" w:after="48" w:line="240" w:lineRule="auto"/>
         <w:pBdr>
           <w:bottom w:val="single" w:sz="6" w:space="1" w:color="000000"/>
         </w:pBdr>

</xml_diff>